<commit_message>
fix(report): 修复 Word 报告 11 处审计问题
修复内容:
1. 删除幽灵图表引用(09_three_country_m2.png 已删除文件)
   - 删除 line 390-398 的 add_chart + 后续描述段落
2. S1 信号定义统一为 Capex/Rev 比率 35%
   - S1 标题改为「S1：云厂商 Capex/Rev 比率突破 35%」
   - S1 表格阈值改为「M7 Capex/Rev 比率连续两季 >35%，或单季从峰值回落 >5pct」
3. S3 表格补充 P/S > 25x 阈值
   - 阈值行改为「① 英伟达跌破 200 日均线 ② NVDA P/S > 25x 且营收环比增速降至个位数 ③ 微软 Copilot 付费渗透率停滞」
4. 图表编号重排为 1-12 连续整数
   - 修复重复编号(图表1×2, 图表2.5×2)
   - 消除分数编号(图表6.5→8, 图表8.5→11)
   - 更新所有正文中引用图表编号的段落
5. S3 分析逻辑矛盾修复
   - 原文「20x 仍高于 25x 阈值？不对」自相矛盾
   - 改为「当前 20x 低于 25x 阈值线，S3 估值条件尚未满足」
6. 小问题修复
   - 图表 1 分析段落补充「2007 年峰值数据」年份说明
   - NVDA 股价注明「拆股后基准」
   - NVDA 集中度对比逻辑改为「即 AI 龙头集中度远高于 05-07」
   - 附录 B 图表引用更新(图表3→5, 图表4→6)
7. generate_charts.py 删除 cn_fx/us_fx/jp_fx 死代码(变量名反转且未使用)

文件清单:
- generate_charts.py: 删除 3 行死代码
- generate_docx.py: ~76 行修改(删除 8 行, 修改 ~30 行 caption/文字, 修正逻辑)
- docx: 175 段落, 9 表格, 2.9MB
</commit_message>
<xml_diff>
--- a/TopicResearch/report/复盘05-07有色vs当前AI板块投资研究.docx
+++ b/TopicResearch/report/复盘05-07有色vs当前AI板块投资研究.docx
@@ -104,7 +104,7 @@
         <w:ind w:firstLine="440"/>
       </w:pPr>
       <w:r>
-        <w:t>2008 年金融危机后，全球资本市场经历了近 15 年的「低利率 + 低增长」长期停滞。直至 2022 年 11 月 ChatGPT 的横空出世，「AGI 革命」叙事点燃了新一轮资本开支浪潮——M7（Magnificent 7，Apple、Microsoft、Google、Amazon、Meta、Tesla、NVIDIA）在 2023–2026 年间将云端 Capex 累计推高至数千亿美元规模，NVIDIA 股价从 $14 涨至 $130（+800%），纳斯达克 100 指数从 11000 点冲至 21500 点（+95%）。</w:t>
+        <w:t>2008 年金融危机后，全球资本市场经历了近 15 年的「低利率 + 低增长」长期停滞。直至 2022 年 11 月 ChatGPT 的横空出世，「AGI 革命」叙事点燃了新一轮资本开支浪潮——M7（Magnificent 7，Apple、Microsoft、Google、Amazon、Meta、Tesla、NVIDIA）在 2023–2026 年间将云端 Capex 累计推高至数千亿美元规模，NVIDIA 股价从 $14（拆股后基准）涨至 $130（+800%），纳斯达克 100 指数从 11000 点冲至 21500 点（+95%）。</w:t>
       </w:r>
     </w:p>
     <w:p>
@@ -312,7 +312,7 @@
         <w:spacing w:line="408" w:lineRule="auto" w:after="80"/>
       </w:pPr>
       <w:r>
-        <w:t>图表 1（9a+9d）清晰揭示了三国宏观背景的**结构性差异**：中国 GDP 增速 14.2%（加速）vs 美国 1.9%（减速）vs 日本 0.8%（通缩挣扎）；**中国外储/GDP 48% = 美国的 28 倍、日本的 2.3 倍**——这是全球失衡的极致表现。9b M2 增速同样显示中国 18.5% 是美国的 3.3 倍、日本的 13 倍。9c CPI 显示中国通胀 4.8%（工业品价格上行）vs 日本 0%（持续通缩）。</w:t>
+        <w:t>图表 1（9a+9d）清晰揭示了三国宏观背景的**结构性差异**（2007 年峰值数据）：中国 GDP 增速 14.2%（加速）vs 美国 1.9%（减速）vs 日本 0.8%（通缩挣扎）；**中国外储/GDP 48% = 美国的 28 倍、日本的 2.3 倍**——这是全球失衡的极致表现。9b M2 增速同样显示中国 18.5% 是美国的 3.3 倍、日本的 13 倍。9c CPI 显示中国通胀 4.8%（工业品价格上行）vs 日本 0%（持续通缩）。</w:t>
       </w:r>
     </w:p>
     <w:p>
@@ -415,7 +415,7 @@
           <w:color w:val="64748B"/>
           <w:sz w:val="19"/>
         </w:rPr>
-        <w:t>图表 1：2007 年三国货币政策三层利率对比——揭示中国管制利率倒挂与贷存利差 3.33%</w:t>
+        <w:t>图表 2：2007 年三国货币政策三层利率对比——揭示中国管制利率倒挂与贷存利差 3.33%</w:t>
       </w:r>
     </w:p>
     <w:p>
@@ -523,7 +523,7 @@
           <w:color w:val="64748B"/>
           <w:sz w:val="19"/>
         </w:rPr>
-        <w:t>图表 2：中国外汇占款完整传导链（2005-2008）——贸易顺差→外储→外汇占款→M2 增速的 4 变量协同</w:t>
+        <w:t>图表 3：中国外汇占款完整传导链（2005-2008）——贸易顺差→外储→外汇占款→M2 增速的 4 变量协同</w:t>
       </w:r>
     </w:p>
     <w:p>
@@ -585,7 +585,7 @@
           <w:color w:val="64748B"/>
           <w:sz w:val="19"/>
         </w:rPr>
-        <w:t>图表 2.5：美元指数 vs LME 铜价（2005-2008）——验证"美元贬值 = 商品燃料"</w:t>
+        <w:t>图表 4：美元指数 vs LME 铜价（2005-2008）——验证"美元贬值 = 商品燃料"</w:t>
       </w:r>
     </w:p>
     <w:p>
@@ -593,15 +593,7 @@
         <w:spacing w:line="408" w:lineRule="auto" w:after="80"/>
       </w:pPr>
       <w:r>
-        <w:t>图表 2.5 量化验证了「美元贬值 = 商品燃料」这一论断：美元指数 -17% vs LME 铜价 +183%，**两者负相关系数达 0.92**。这意味着 2005-2007 期间每 1% 的美元贬值，对应约 10% 的铜价上涨。这一机制在 23-26 中是否仍成立？这是 HBM/CoWoS 现货价 vs NVDA 股价的关键观察点。</w:t>
-      </w:r>
-    </w:p>
-    <w:p>
-      <w:pPr>
-        <w:spacing w:line="408" w:lineRule="auto" w:after="80"/>
-      </w:pPr>
-      <w:r>
-        <w:t>图表 2.5 揭示了三国 M2 增速的**惊人差异**：2007 年中国 M2 增速 18.5%，是美国的 3.3 倍、日本的 13 倍。**这意味着中国是 2005–2007 全球流动性的「主水源」**——中国央行通过外汇占款投放的 8 万亿基础货币，相当于 8 次降准的力度，相当于美联储同期通过 QE 投放的流动性总量。</w:t>
+        <w:t>图表 4 量化验证了「美元贬值 = 商品燃料」这一论断：美元指数 -17% vs LME 铜价 +183%，**两者负相关系数达 0.92**。这意味着 2005-2007 期间每 1% 的美元贬值，对应约 10% 的铜价上涨。这一机制在 23-26 中是否仍成立？这是 HBM/CoWoS 现货价 vs NVDA 股价的关键观察点。</w:t>
       </w:r>
     </w:p>
     <w:p>
@@ -1163,7 +1155,7 @@
           <w:color w:val="64748B"/>
           <w:sz w:val="19"/>
         </w:rPr>
-        <w:t>图表 3：LME 铜价走势与三大阶段（2005-2008）——三阶段叙事可视化</w:t>
+        <w:t>图表 5：LME 铜价走势与三大阶段（2005-2008）——三阶段叙事可视化</w:t>
       </w:r>
     </w:p>
     <w:p>
@@ -1225,7 +1217,7 @@
           <w:color w:val="64748B"/>
           <w:sz w:val="19"/>
         </w:rPr>
-        <w:t>图表 4：LME 铜价 vs 上证综指 归一化对比（2005-06=100）——揭示 17 个月顶背离</w:t>
+        <w:t>图表 6：LME 铜价 vs 上证综指 归一化对比（2005-06=100）——揭示 17 个月顶背离</w:t>
       </w:r>
     </w:p>
     <w:p>
@@ -1233,7 +1225,7 @@
         <w:spacing w:line="408" w:lineRule="auto" w:after="80"/>
       </w:pPr>
       <w:r>
-        <w:t>图表 4 揭示了一个被市场广泛忽视的细节——**LME 铜价早在 2006 年 5 月就已见顶（$8,800），而上证综指直到 2007 年 10 月才见顶（6,124）**。17 个月的「顶背离」是典型的「叙事溢价」阶段——股价不再锚定商品现货，而是锚定「未来注入矿」的无限承诺。</w:t>
+        <w:t>图表 6 揭示了一个被市场广泛忽视的细节——**LME 铜价早在 2006 年 5 月就已见顶（$8,800），而上证综指直到 2007 年 10 月才见顶（6,124）**。17 个月的「顶背离」是典型的「叙事溢价」阶段——股价不再锚定商品现货，而是锚定「未来注入矿」的无限承诺。</w:t>
       </w:r>
     </w:p>
     <w:p>
@@ -1333,7 +1325,7 @@
           <w:color w:val="64748B"/>
           <w:sz w:val="19"/>
         </w:rPr>
-        <w:t>图表 5：三角闭环机制示意图——美国-中国-日本「消费-生产-融资」闭环</w:t>
+        <w:t>图表 7：三角闭环机制示意图——美国-中国-日本「消费-生产-融资」闭环</w:t>
       </w:r>
     </w:p>
     <w:p>
@@ -2128,7 +2120,7 @@
           <w:color w:val="64748B"/>
           <w:sz w:val="19"/>
         </w:rPr>
-        <w:t>图表 6.5：10 维度雷达图——05-07 有色 vs 23-26 AI（重叠区域显示共性，单独区域显示差异）</w:t>
+        <w:t>图表 8：10 维度雷达图——05-07 有色 vs 23-26 AI（重叠区域显示共性，单独区域显示差异）</w:t>
       </w:r>
     </w:p>
     <w:p>
@@ -2136,7 +2128,7 @@
         <w:spacing w:line="408" w:lineRule="auto" w:after="80"/>
       </w:pPr>
       <w:r>
-        <w:t>图表 6.5 用雷达图直观呈现 10 维度对标结果。**重叠区域（深蓝+橙）显示两轮行情的「共性」**，蓝色单独突出的区域（05-07 独有）和橙色单独突出的区域（23-26 独有）显示差异。**最相似的 3 个维度**：驱动叙事（8 vs 9）、龙头涨幅（8 vs 9）、终结模式（8 vs 7）。**最差异的 3 个维度**：前三大经济体（9 vs 5，三角闭环已破裂）、流动性来源（8 vs 7，但机制不同）、估值扩张（9 vs 7，05-07 是 PE 50x 纯梦想，23-26 是 P/S 30x 业绩支撑）。</w:t>
+        <w:t>图表 8 用雷达图直观呈现 10 维度对标结果。**重叠区域（深蓝+橙）显示两轮行情的「共性」**，蓝色单独突出的区域（05-07 独有）和橙色单独突出的区域（23-26 独有）显示差异。**最相似的 3 个维度**：驱动叙事（8 vs 9）、龙头涨幅（8 vs 9）、终结模式（8 vs 7）。**最差异的 3 个维度**：前三大经济体（9 vs 5，三角闭环已破裂）、流动性来源（8 vs 7，但机制不同）、估值扩张（9 vs 7，05-07 是 PE 50x 纯梦想，23-26 是 P/S 30x 业绩支撑）。</w:t>
       </w:r>
     </w:p>
     <w:p>
@@ -2253,7 +2245,7 @@
           <w:color w:val="64748B"/>
           <w:sz w:val="19"/>
         </w:rPr>
-        <w:t>图表 6：M7 云厂商 Capex/Rev 趋势（2024-2026E）——35% 阈值线即 S1 信号触发线</w:t>
+        <w:t>图表 9：M7 云厂商 Capex/Rev 趋势（2024-2026E）——35% 阈值线即 S1 信号触发线</w:t>
       </w:r>
     </w:p>
     <w:p>
@@ -2261,7 +2253,7 @@
         <w:spacing w:line="408" w:lineRule="auto" w:after="80"/>
       </w:pPr>
       <w:r>
-        <w:t>图表 6 呈现了 4 家云厂商的 Capex/Rev 趋势。可以观察到三个关键事实：</w:t>
+        <w:t>图表 9 呈现了 4 家云厂商的 Capex/Rev 趋势。可以观察到三个关键事实：</w:t>
       </w:r>
     </w:p>
     <w:p>
@@ -2356,7 +2348,7 @@
           <w:color w:val="64748B"/>
           <w:sz w:val="19"/>
         </w:rPr>
-        <w:t>图表 7：NDX vs NVDA 归一化对比（2022-11=100）——NVDA 涨幅 8 倍于 NDX</w:t>
+        <w:t>图表 10：NDX vs NVDA 归一化对比（2022-11=100）——NVDA 涨幅 8 倍于 NDX</w:t>
       </w:r>
     </w:p>
     <w:p>
@@ -2364,7 +2356,7 @@
         <w:spacing w:line="408" w:lineRule="auto" w:after="80"/>
       </w:pPr>
       <w:r>
-        <w:t>图表 7 揭示了 23-26 浪潮的一个关键特征：**NVDA 涨幅 800% 远超 NDX 整体 95%**——这是 2005-2007 没有的现象（彼时云铜 +1,122%，但有色指数整体 +1,857%，板块涨幅大于单股），这意味着 AI 浪潮的「龙头集中度」远高于 2005-2007。</w:t>
+        <w:t>图表 10 揭示了 23-26 浪潮的一个关键特征：**NVDA 涨幅 800% 远超 NDX 整体 95%**——即 AI 龙头集中度远高于 2005-2007。彼时云铜 +1,122%，但有色指数整体 +1,857%，板块涨幅大于单股；而 AI 浪潮恰好相反，单股涨幅远超板块。</w:t>
       </w:r>
     </w:p>
     <w:p>
@@ -2461,7 +2453,7 @@
           <w:color w:val="1E3A5F"/>
           <w:sz w:val="26"/>
         </w:rPr>
-        <w:t>§3.1　S1：云厂商 Capex 增速二阶导转负</w:t>
+        <w:t>§3.1　S1：云厂商 Capex/Rev 比率突破 35%</w:t>
       </w:r>
     </w:p>
     <w:p>
@@ -2642,7 +2634,7 @@
               <w:rPr>
                 <w:sz w:val="19"/>
               </w:rPr>
-              <w:t>M7 Capex 同比增速连续两季 &lt;20% 或环比负增长</w:t>
+              <w:t>M7 Capex/Rev 比率连续两季 &gt;35%，或单季从峰值回落 &gt;5pct</w:t>
             </w:r>
           </w:p>
         </w:tc>
@@ -2680,7 +2672,7 @@
               <w:rPr>
                 <w:sz w:val="19"/>
               </w:rPr>
-              <w:t>**未触发**（M7 Capex/Rev 30%，增速仍高，距 35% 阈值 5pct）</w:t>
+              <w:t>**未触发**（M7 Capex/Rev 30%，距 35% 阈值 5pct）</w:t>
             </w:r>
           </w:p>
         </w:tc>
@@ -3563,7 +3555,7 @@
               <w:rPr>
                 <w:sz w:val="19"/>
               </w:rPr>
-              <w:t>① 英伟达跌破 200 日均线 ② 微软 Copilot 付费渗透率停滞</w:t>
+              <w:t>① 英伟达跌破 200 日均线 ② NVDA P/S &gt; 25x 且营收环比增速降至个位数 ③ 微软 Copilot 付费渗透率停滞</w:t>
             </w:r>
           </w:p>
         </w:tc>
@@ -3744,7 +3736,7 @@
           <w:color w:val="64748B"/>
           <w:sz w:val="19"/>
         </w:rPr>
-        <w:t>图表 8.5：S3 双阈值监测（2023Q1-2026Q2）——NVDA P/S + Copilot 渗透率</w:t>
+        <w:t>图表 11：S3 双阈值监测（2023Q1-2026Q2）——NVDA P/S + Copilot 渗透率</w:t>
       </w:r>
     </w:p>
     <w:p>
@@ -3752,7 +3744,7 @@
         <w:spacing w:line="408" w:lineRule="auto" w:after="80"/>
       </w:pPr>
       <w:r>
-        <w:t>图表 8.5 量化呈现了 S3 双重阈值的当前状态。**两个关键观察**：</w:t>
+        <w:t>图表 11 量化呈现了 S3 双重阈值的当前状态。**两个关键观察**：</w:t>
       </w:r>
     </w:p>
     <w:p>
@@ -3761,7 +3753,7 @@
         <w:ind w:firstLine="440"/>
       </w:pPr>
       <w:r>
-        <w:t>**第一，NVDA P/S 在 2023Q1 高位（28-32x）已逐步消化至 2026Q2 的 20x**，——业绩增长在「消化」高估值。但 20x 仍高于 25x 阈值？不对，**20x &lt; 25x 阈值线**，意味着当前 P/S 已经在 25x 阈值之下，**但市场未崩盘**——这是因为营收仍在高速增长。</w:t>
+        <w:t>**第一，NVDA P/S 在 2023Q1 高位（28-32x）已逐步消化至 2026Q2 的 20x**，——业绩增长在「消化」高估值。当前 20x 低于 25x 阈值线，**S3 估值条件尚未满足**。但如果 NVDA 股价在营收增速放缓前继续上涨，P/S 重新升破 25x，则 S3 估值条件将就绪。</w:t>
       </w:r>
     </w:p>
     <w:p>
@@ -3783,7 +3775,7 @@
           <w:b/>
           <w:color w:val="B45309"/>
         </w:rPr>
-        <w:t>**关键洞察**：S3 当前状态 = 「双阈值边缘」（P/S 距阈值 5 点，Copilot 已触阈值）。**最可能的触发路径**：Copilot 渗透率 2026Q3 停滞 → NVDA 营收增速降至个位数 → P/S 估值切换 → 股价跌破 200 日均线 → S3 触发。</w:t>
+        <w:t>**关键洞察**：S3 当前状态 = 「双阈值边缘」（P/S 距 25x 阈值 5 点，Copilot 已触阈值）。**最可能的触发路径**：NVDA 股价继续上涨使 P/S 升破 25x → Copilot 渗透率 2026Q3 停滞 → NVDA 营收增速降至个位数 → P/S 估值切换 → 股价跌破 200 日均线 → S3 触发。</w:t>
       </w:r>
     </w:p>
     <w:p>
@@ -3851,7 +3843,7 @@
           <w:color w:val="64748B"/>
           <w:sz w:val="19"/>
         </w:rPr>
-        <w:t>图表 8：三大量化顶部信号当前状态仪表盘（2026-06）</w:t>
+        <w:t>图表 12：三大量化顶部信号当前状态仪表盘（2026-06）</w:t>
       </w:r>
     </w:p>
     <w:p>
@@ -3859,7 +3851,7 @@
         <w:spacing w:line="408" w:lineRule="auto" w:after="80"/>
       </w:pPr>
       <w:r>
-        <w:t>图表 8 以仪表盘形式呈现了 3 个信号的当前状态。**综合评分 0/3 ~ 0.5/3**——S1 接近触发但未触发（Capex/Rev 30% 距阈值 5pct），S2/S3 距离触发仍有空间。</w:t>
+        <w:t>图表 12 以仪表盘形式呈现了 3 个信号的当前状态。**综合评分 0/3 ~ 0.5/3**——S1 接近触发但未触发（M7 Capex/Rev 30%，距 35% 阈值仅 5pct），S2/S3 距离触发仍有空间。</w:t>
       </w:r>
     </w:p>
     <w:p>
@@ -4643,7 +4635,7 @@
         <w:spacing w:line="408" w:lineRule="auto" w:after="80"/>
       </w:pPr>
       <w:r>
-        <w:t>本附录以时间顺序列出 2005-2007 期间对市场产生重大影响的 16 个事件，供读者对照图表 3、图表 4 的事件标注查阅。</w:t>
+        <w:t>本附录以时间顺序列出 2005-2007 期间对市场产生重大影响的 16 个事件，供读者对照图表 5、图表 6 的事件标注查阅。</w:t>
       </w:r>
     </w:p>
     <w:tbl>

</xml_diff>